<commit_message>
Phase 1B: reaction-wheel fault model + MTQ momentum management + fault-tolerant allocator
- dynamics: per-wheel health H in [0,1] (tau_actual = H * tau_cmd)
- controllers: fault-tolerant allocation (invert health, residual torque to MTQ,
  MTQ momentum desaturation)
- simulate: run_episode(rw_health=..., momentum_mgmt=...)
- scripts/run_fault_experiment.py: healthy vs RW1 50% vs RW1 failed
- results: healthy 86.7%, RW1 50% fully compensated (86.7%), RW1 failed 0% (underactuated)
- docs: RUN_AND_VERIFY.md; regenerated Persian state report
</commit_message>
<xml_diff>
--- a/codes/reports/report-state-1.docx
+++ b/codes/reports/report-state-1.docx
@@ -2,10 +2,686 @@
 <file path=word/document.xml><?xml version="1.0" encoding="utf-8"?>
 <w:document xmlns:wpc="http://schemas.microsoft.com/office/word/2010/wordprocessingCanvas" xmlns:cx="http://schemas.microsoft.com/office/drawing/2014/chartex" xmlns:cx1="http://schemas.microsoft.com/office/drawing/2015/9/8/chartex" xmlns:cx2="http://schemas.microsoft.com/office/drawing/2015/10/21/chartex" xmlns:cx3="http://schemas.microsoft.com/office/drawing/2016/5/9/chartex" xmlns:cx4="http://schemas.microsoft.com/office/drawing/2016/5/10/chartex" xmlns:cx5="http://schemas.microsoft.com/office/drawing/2016/5/11/chartex" xmlns:cx6="http://schemas.microsoft.com/office/drawing/2016/5/12/chartex" xmlns:cx7="http://schemas.microsoft.com/office/drawing/2016/5/13/chartex" xmlns:cx8="http://schemas.microsoft.com/office/drawing/2016/5/14/chartex" xmlns:mc="http://schemas.openxmlformats.org/markup-compatibility/2006" xmlns:aink="http://schemas.microsoft.com/office/drawing/2016/ink" xmlns:am3d="http://schemas.microsoft.com/office/drawing/2017/model3d" xmlns:o="urn:schemas-microsoft-com:office:office" xmlns:oel="http://schemas.microsoft.com/office/2019/extlst" xmlns:r="http://schemas.openxmlformats.org/officeDocument/2006/relationships" xmlns:m="http://schemas.openxmlformats.org/officeDocument/2006/math" xmlns:v="urn:schemas-microsoft-com:vml" xmlns:wp14="http://schemas.microsoft.com/office/word/2010/wordprocessingDrawing" xmlns:wp="http://schemas.openxmlformats.org/drawingml/2006/wordprocessingDrawing" xmlns:w10="urn:schemas-microsoft-com:office:word" xmlns:w="http://schemas.openxmlformats.org/wordprocessingml/2006/main" xmlns:w14="http://schemas.microsoft.com/office/word/2010/wordml" xmlns:w15="http://schemas.microsoft.com/office/word/2012/wordml" xmlns:w16cex="http://schemas.microsoft.com/office/word/2018/wordml/cex" xmlns:w16cid="http://schemas.microsoft.com/office/word/2016/wordml/cid" xmlns:w16="http://schemas.microsoft.com/office/word/2018/wordml" xmlns:w16du="http://schemas.microsoft.com/office/word/2023/wordml/word16du" xmlns:w16sdtdh="http://schemas.microsoft.com/office/word/2020/wordml/sdtdatahash" xmlns:w16sdtfl="http://schemas.microsoft.com/office/word/2024/wordml/sdtformatlock" xmlns:w16se="http://schemas.microsoft.com/office/word/2015/wordml/symex" xmlns:wpg="http://schemas.microsoft.com/office/word/2010/wordprocessingGroup" xmlns:wpi="http://schemas.microsoft.com/office/word/2010/wordprocessingInk" xmlns:wne="http://schemas.microsoft.com/office/word/2006/wordml" xmlns:wps="http://schemas.microsoft.com/office/word/2010/wordprocessingShape" mc:Ignorable="w14 w15 w16se w16cid w16 w16cex w16sdtdh w16sdtfl w16du wp14">
   <w:body>
+    <w:p/>
+    <w:p>
+      <w:pPr>
+        <w:bidi/>
+        <w:jc w:val="center"/>
+        <w:rPr>
+          <w:rFonts w:cs="B Nazanin"/>
+          <w:b/>
+          <w:bCs/>
+          <w:sz w:val="24"/>
+          <w:szCs w:val="24"/>
+          <w:rtl/>
+        </w:rPr>
+      </w:pPr>
+      <w:r>
+        <w:rPr>
+          <w:rFonts w:cs="Times New Roman"/>
+          <w:b/>
+          <w:bCs/>
+          <w:noProof/>
+          <w:rtl/>
+        </w:rPr>
+        <mc:AlternateContent>
+          <mc:Choice Requires="wps">
+            <w:drawing>
+              <wp:anchor distT="0" distB="0" distL="114300" distR="114300" simplePos="0" relativeHeight="251657728" behindDoc="1" locked="0" layoutInCell="1" allowOverlap="1" wp14:anchorId="21D0EA46" wp14:editId="66B8494F">
+                <wp:simplePos x="0" y="0"/>
+                <wp:positionH relativeFrom="margin">
+                  <wp:align>center</wp:align>
+                </wp:positionH>
+                <wp:positionV relativeFrom="margin">
+                  <wp:align>center</wp:align>
+                </wp:positionV>
+                <wp:extent cx="6267450" cy="8324850"/>
+                <wp:effectExtent l="19050" t="19050" r="38100" b="38100"/>
+                <wp:wrapNone/>
+                <wp:docPr id="711124219" name="Rounded Rectangle 2"/>
+                <wp:cNvGraphicFramePr/>
+                <a:graphic xmlns:a="http://schemas.openxmlformats.org/drawingml/2006/main">
+                  <a:graphicData uri="http://schemas.microsoft.com/office/word/2010/wordprocessingShape">
+                    <wps:wsp>
+                      <wps:cNvSpPr/>
+                      <wps:spPr>
+                        <a:xfrm>
+                          <a:off x="0" y="0"/>
+                          <a:ext cx="6267450" cy="8324850"/>
+                        </a:xfrm>
+                        <a:prstGeom prst="roundRect">
+                          <a:avLst/>
+                        </a:prstGeom>
+                        <a:noFill/>
+                        <a:ln w="63500" cmpd="thickThin"/>
+                      </wps:spPr>
+                      <wps:style>
+                        <a:lnRef idx="2">
+                          <a:schemeClr val="accent1"/>
+                        </a:lnRef>
+                        <a:fillRef idx="1">
+                          <a:schemeClr val="lt1"/>
+                        </a:fillRef>
+                        <a:effectRef idx="0">
+                          <a:schemeClr val="accent1"/>
+                        </a:effectRef>
+                        <a:fontRef idx="minor">
+                          <a:schemeClr val="dk1"/>
+                        </a:fontRef>
+                      </wps:style>
+                      <wps:bodyPr rot="0" spcFirstLastPara="0" vertOverflow="overflow" horzOverflow="overflow" vert="horz" wrap="square" lIns="91440" tIns="45720" rIns="91440" bIns="45720" numCol="1" spcCol="0" rtlCol="0" fromWordArt="0" anchor="ctr" anchorCtr="0" forceAA="0" compatLnSpc="1">
+                        <a:prstTxWarp prst="textNoShape">
+                          <a:avLst/>
+                        </a:prstTxWarp>
+                        <a:noAutofit/>
+                      </wps:bodyPr>
+                    </wps:wsp>
+                  </a:graphicData>
+                </a:graphic>
+                <wp14:sizeRelH relativeFrom="margin">
+                  <wp14:pctWidth>0</wp14:pctWidth>
+                </wp14:sizeRelH>
+                <wp14:sizeRelV relativeFrom="margin">
+                  <wp14:pctHeight>0</wp14:pctHeight>
+                </wp14:sizeRelV>
+              </wp:anchor>
+            </w:drawing>
+          </mc:Choice>
+          <mc:Fallback>
+            <w:pict>
+              <v:roundrect w14:anchorId="54172848" id="Rounded Rectangle 2" o:spid="_x0000_s1026" style="position:absolute;margin-left:0;margin-top:0;width:493.5pt;height:655.5pt;z-index:-251658752;visibility:visible;mso-wrap-style:square;mso-width-percent:0;mso-height-percent:0;mso-wrap-distance-left:9pt;mso-wrap-distance-top:0;mso-wrap-distance-right:9pt;mso-wrap-distance-bottom:0;mso-position-horizontal:center;mso-position-horizontal-relative:margin;mso-position-vertical:center;mso-position-vertical-relative:margin;mso-width-percent:0;mso-height-percent:0;mso-width-relative:margin;mso-height-relative:margin;v-text-anchor:middle" arcsize="10923f" o:gfxdata="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" filled="f" strokecolor="#4f81bd [3204]" strokeweight="5pt">
+                <v:stroke linestyle="thickThin"/>
+                <w10:wrap anchorx="margin" anchory="margin"/>
+              </v:roundrect>
+            </w:pict>
+          </mc:Fallback>
+        </mc:AlternateContent>
+      </w:r>
+      <w:r>
+        <w:rPr>
+          <w:noProof/>
+          <w:sz w:val="28"/>
+          <w:szCs w:val="28"/>
+        </w:rPr>
+        <w:drawing>
+          <wp:anchor distT="0" distB="0" distL="114300" distR="114300" simplePos="0" relativeHeight="251655680" behindDoc="0" locked="0" layoutInCell="1" allowOverlap="1" wp14:anchorId="46E13949" wp14:editId="495F7A57">
+            <wp:simplePos x="0" y="0"/>
+            <wp:positionH relativeFrom="margin">
+              <wp:posOffset>227281</wp:posOffset>
+            </wp:positionH>
+            <wp:positionV relativeFrom="margin">
+              <wp:posOffset>229235</wp:posOffset>
+            </wp:positionV>
+            <wp:extent cx="1204595" cy="914400"/>
+            <wp:effectExtent l="0" t="0" r="0" b="0"/>
+            <wp:wrapSquare wrapText="bothSides"/>
+            <wp:docPr id="722941437" name="Picture 2"/>
+            <wp:cNvGraphicFramePr>
+              <a:graphicFrameLocks xmlns:a="http://schemas.openxmlformats.org/drawingml/2006/main" noChangeAspect="1"/>
+            </wp:cNvGraphicFramePr>
+            <a:graphic xmlns:a="http://schemas.openxmlformats.org/drawingml/2006/main">
+              <a:graphicData uri="http://schemas.openxmlformats.org/drawingml/2006/picture">
+                <pic:pic xmlns:pic="http://schemas.openxmlformats.org/drawingml/2006/picture">
+                  <pic:nvPicPr>
+                    <pic:cNvPr id="722941437" name="Picture 722941437"/>
+                    <pic:cNvPicPr/>
+                  </pic:nvPicPr>
+                  <pic:blipFill>
+                    <a:blip r:embed="rId8" cstate="print">
+                      <a:extLst>
+                        <a:ext uri="{28A0092B-C50C-407E-A947-70E740481C1C}">
+                          <a14:useLocalDpi xmlns:a14="http://schemas.microsoft.com/office/drawing/2010/main" val="0"/>
+                        </a:ext>
+                      </a:extLst>
+                    </a:blip>
+                    <a:stretch>
+                      <a:fillRect/>
+                    </a:stretch>
+                  </pic:blipFill>
+                  <pic:spPr>
+                    <a:xfrm>
+                      <a:off x="0" y="0"/>
+                      <a:ext cx="1204595" cy="914400"/>
+                    </a:xfrm>
+                    <a:prstGeom prst="rect">
+                      <a:avLst/>
+                    </a:prstGeom>
+                  </pic:spPr>
+                </pic:pic>
+              </a:graphicData>
+            </a:graphic>
+          </wp:anchor>
+        </w:drawing>
+      </w:r>
+      <w:r>
+        <w:rPr>
+          <w:noProof/>
+          <w:sz w:val="28"/>
+          <w:szCs w:val="28"/>
+        </w:rPr>
+        <w:drawing>
+          <wp:anchor distT="0" distB="0" distL="114300" distR="114300" simplePos="0" relativeHeight="251656704" behindDoc="0" locked="0" layoutInCell="1" allowOverlap="1" wp14:anchorId="6EE526C2" wp14:editId="680CC16F">
+            <wp:simplePos x="0" y="0"/>
+            <wp:positionH relativeFrom="margin">
+              <wp:posOffset>4686935</wp:posOffset>
+            </wp:positionH>
+            <wp:positionV relativeFrom="margin">
+              <wp:posOffset>226695</wp:posOffset>
+            </wp:positionV>
+            <wp:extent cx="931545" cy="914400"/>
+            <wp:effectExtent l="0" t="0" r="1905" b="0"/>
+            <wp:wrapSquare wrapText="bothSides"/>
+            <wp:docPr id="284234937" name="Picture 1"/>
+            <wp:cNvGraphicFramePr>
+              <a:graphicFrameLocks xmlns:a="http://schemas.openxmlformats.org/drawingml/2006/main" noChangeAspect="1"/>
+            </wp:cNvGraphicFramePr>
+            <a:graphic xmlns:a="http://schemas.openxmlformats.org/drawingml/2006/main">
+              <a:graphicData uri="http://schemas.openxmlformats.org/drawingml/2006/picture">
+                <pic:pic xmlns:pic="http://schemas.openxmlformats.org/drawingml/2006/picture">
+                  <pic:nvPicPr>
+                    <pic:cNvPr id="284234937" name="Picture 284234937"/>
+                    <pic:cNvPicPr/>
+                  </pic:nvPicPr>
+                  <pic:blipFill rotWithShape="1">
+                    <a:blip r:embed="rId9" cstate="print">
+                      <a:extLst>
+                        <a:ext uri="{28A0092B-C50C-407E-A947-70E740481C1C}">
+                          <a14:useLocalDpi xmlns:a14="http://schemas.microsoft.com/office/drawing/2010/main" val="0"/>
+                        </a:ext>
+                      </a:extLst>
+                    </a:blip>
+                    <a:srcRect l="5237" t="6333" r="5057" b="5615"/>
+                    <a:stretch/>
+                  </pic:blipFill>
+                  <pic:spPr bwMode="auto">
+                    <a:xfrm>
+                      <a:off x="0" y="0"/>
+                      <a:ext cx="931545" cy="914400"/>
+                    </a:xfrm>
+                    <a:prstGeom prst="rect">
+                      <a:avLst/>
+                    </a:prstGeom>
+                    <a:ln>
+                      <a:noFill/>
+                    </a:ln>
+                    <a:extLst>
+                      <a:ext uri="{53640926-AAD7-44D8-BBD7-CCE9431645EC}">
+                        <a14:shadowObscured xmlns:a14="http://schemas.microsoft.com/office/drawing/2010/main"/>
+                      </a:ext>
+                    </a:extLst>
+                  </pic:spPr>
+                </pic:pic>
+              </a:graphicData>
+            </a:graphic>
+            <wp14:sizeRelH relativeFrom="margin">
+              <wp14:pctWidth>0</wp14:pctWidth>
+            </wp14:sizeRelH>
+            <wp14:sizeRelV relativeFrom="margin">
+              <wp14:pctHeight>0</wp14:pctHeight>
+            </wp14:sizeRelV>
+          </wp:anchor>
+        </w:drawing>
+      </w:r>
+    </w:p>
+    <w:p>
+      <w:pPr>
+        <w:bidi/>
+        <w:spacing w:after="0" w:line="720" w:lineRule="auto"/>
+        <w:jc w:val="center"/>
+        <w:rPr>
+          <w:rFonts w:cs="B Nazanin"/>
+          <w:b/>
+          <w:bCs/>
+          <w:sz w:val="32"/>
+          <w:szCs w:val="32"/>
+        </w:rPr>
+      </w:pPr>
+      <w:r>
+        <w:rPr>
+          <w:rFonts w:cs="B Nazanin" w:hint="cs"/>
+          <w:b/>
+          <w:bCs/>
+          <w:sz w:val="32"/>
+          <w:szCs w:val="32"/>
+          <w:rtl/>
+        </w:rPr>
+        <w:t xml:space="preserve">   </w:t>
+      </w:r>
+      <w:r>
+        <w:rPr>
+          <w:rFonts w:cs="B Nazanin" w:hint="cs"/>
+          <w:b/>
+          <w:bCs/>
+          <w:sz w:val="32"/>
+          <w:szCs w:val="32"/>
+          <w:rtl/>
+        </w:rPr>
+        <w:t xml:space="preserve"> </w:t>
+      </w:r>
+      <w:r>
+        <w:rPr>
+          <w:rFonts w:cs="B Nazanin" w:hint="cs"/>
+          <w:b/>
+          <w:bCs/>
+          <w:sz w:val="32"/>
+          <w:szCs w:val="32"/>
+          <w:rtl/>
+        </w:rPr>
+        <w:t xml:space="preserve"> </w:t>
+      </w:r>
+      <w:r>
+        <w:rPr>
+          <w:rFonts w:cs="B Nazanin" w:hint="cs"/>
+          <w:b/>
+          <w:bCs/>
+          <w:sz w:val="32"/>
+          <w:szCs w:val="32"/>
+          <w:rtl/>
+          <w:lang w:bidi="fa-IR"/>
+        </w:rPr>
+        <w:t xml:space="preserve">به </w:t>
+      </w:r>
+      <w:r>
+        <w:rPr>
+          <w:rFonts w:cs="B Nazanin" w:hint="cs"/>
+          <w:b/>
+          <w:bCs/>
+          <w:sz w:val="32"/>
+          <w:szCs w:val="32"/>
+          <w:rtl/>
+        </w:rPr>
+        <w:t>نام خدا</w:t>
+      </w:r>
+    </w:p>
+    <w:p>
+      <w:pPr>
+        <w:bidi/>
+        <w:jc w:val="center"/>
+        <w:rPr>
+          <w:rFonts w:cs="B Nazanin"/>
+          <w:sz w:val="32"/>
+          <w:szCs w:val="32"/>
+        </w:rPr>
+      </w:pPr>
+      <w:sdt>
+        <w:sdtPr>
+          <w:rPr>
+            <w:rFonts w:cs="B Nazanin"/>
+            <w:b/>
+            <w:bCs/>
+            <w:sz w:val="32"/>
+            <w:szCs w:val="32"/>
+            <w:rtl/>
+          </w:rPr>
+          <w:alias w:val="دانشكده"/>
+          <w:tag w:val="دانشكده"/>
+          <w:id w:val="-557714299"/>
+          <w:placeholder>
+            <w:docPart w:val="28E4DCBA4D614B94A8A69633A5BBB639"/>
+          </w:placeholder>
+          <w:dropDownList>
+            <w:listItem w:value="Choose an item."/>
+            <w:listItem w:displayText="دانشكده مهندسي برق و كامپيوتر " w:value="دانشكده مهندسي برق و كامپيوتر "/>
+            <w:listItem w:displayText="دانشكده مهندسي عمران" w:value="دانشكده مهندسي عمران"/>
+            <w:listItem w:displayText="دانشكده مهندسي نقشه برداري" w:value="دانشكده مهندسي نقشه برداري"/>
+            <w:listItem w:displayText="دانشكده مهندسي شيمي" w:value="دانشكده مهندسي شيمي"/>
+            <w:listItem w:displayText="دانشكده مهندسي معدن" w:value="دانشكده مهندسي معدن"/>
+            <w:listItem w:displayText="دانشكده مهندسي مكانيك" w:value="دانشكده مهندسي مكانيك"/>
+            <w:listItem w:displayText="دانشكده مهندسي متالورژي و مواد" w:value="دانشكده مهندسي متالورژي و مواد"/>
+            <w:listItem w:displayText="دانشكده علوم مهندسي" w:value="دانشكده علوم مهندسي"/>
+            <w:listItem w:displayText="دانشكده مهندسي صنايع" w:value="دانشكده مهندسي صنايع"/>
+            <w:listItem w:displayText="دانشكده مهندسي شيمي - فومن" w:value="دانشكده مهندسي شيمي - فومن"/>
+            <w:listItem w:displayText="دانشكده مهندسي شيمي - كاسپين" w:value="دانشكده مهندسي شيمي - كاسپين"/>
+            <w:listItem w:displayText="دانشكده مهندسي صنايع - فومن" w:value="دانشكده مهندسي صنايع - فومن"/>
+            <w:listItem w:displayText="دانشكده مهندسي صنايع - كاسپين" w:value="دانشكده مهندسي صنايع - كاسپين"/>
+          </w:dropDownList>
+        </w:sdtPr>
+        <w:sdtContent>
+          <w:r>
+            <w:rPr>
+              <w:rFonts w:cs="B Nazanin"/>
+              <w:b/>
+              <w:bCs/>
+              <w:sz w:val="32"/>
+              <w:szCs w:val="32"/>
+              <w:rtl/>
+            </w:rPr>
+            <w:t xml:space="preserve">دانشكده مهندسي برق و كامپيوتر </w:t>
+          </w:r>
+        </w:sdtContent>
+      </w:sdt>
+    </w:p>
+    <w:p>
+      <w:pPr>
+        <w:bidi/>
+        <w:jc w:val="center"/>
+        <w:rPr>
+          <w:rFonts w:cs="B Nazanin"/>
+          <w:b/>
+          <w:bCs/>
+          <w:sz w:val="32"/>
+          <w:szCs w:val="32"/>
+          <w:rtl/>
+          <w:lang w:bidi="fa-IR"/>
+        </w:rPr>
+      </w:pPr>
+      <w:r>
+        <w:rPr>
+          <w:rFonts w:cs="B Nazanin" w:hint="cs"/>
+          <w:b/>
+          <w:bCs/>
+          <w:sz w:val="32"/>
+          <w:szCs w:val="32"/>
+          <w:rtl/>
+          <w:lang w:bidi="fa-IR"/>
+        </w:rPr>
+        <w:t>پردیس دانشکده‎های فنی</w:t>
+      </w:r>
+    </w:p>
+    <w:p>
+      <w:pPr>
+        <w:bidi/>
+        <w:jc w:val="center"/>
+        <w:rPr>
+          <w:rFonts w:cs="B Nazanin"/>
+          <w:b/>
+          <w:bCs/>
+          <w:sz w:val="32"/>
+          <w:szCs w:val="32"/>
+          <w:rtl/>
+          <w:lang w:bidi="fa-IR"/>
+        </w:rPr>
+      </w:pPr>
+      <w:r>
+        <w:rPr>
+          <w:rFonts w:cs="B Nazanin" w:hint="cs"/>
+          <w:b/>
+          <w:bCs/>
+          <w:sz w:val="32"/>
+          <w:szCs w:val="32"/>
+          <w:rtl/>
+          <w:lang w:bidi="fa-IR"/>
+        </w:rPr>
+        <w:t>دانشگاه تهران</w:t>
+      </w:r>
+    </w:p>
+    <w:p>
+      <w:pPr>
+        <w:rPr>
+          <w:rtl/>
+        </w:rPr>
+      </w:pPr>
+    </w:p>
+    <w:p>
+      <w:pPr>
+        <w:bidi/>
+        <w:jc w:val="center"/>
+        <w:rPr>
+          <w:rFonts w:cs="B Nazanin"/>
+          <w:b/>
+          <w:bCs/>
+          <w:sz w:val="40"/>
+          <w:szCs w:val="40"/>
+          <w:rtl/>
+          <w:lang w:bidi="fa-IR"/>
+        </w:rPr>
+      </w:pPr>
+      <w:r>
+        <w:rPr>
+          <w:rFonts w:cs="B Nazanin" w:hint="cs"/>
+          <w:b/>
+          <w:bCs/>
+          <w:sz w:val="40"/>
+          <w:szCs w:val="40"/>
+          <w:rtl/>
+          <w:lang w:bidi="fa-IR"/>
+        </w:rPr>
+        <w:t>گزارش پروژه</w:t>
+      </w:r>
+      <w:r>
+        <w:rPr>
+          <w:rFonts w:cs="B Nazanin"/>
+          <w:b/>
+          <w:bCs/>
+          <w:sz w:val="40"/>
+          <w:szCs w:val="40"/>
+          <w:rtl/>
+          <w:lang w:bidi="fa-IR"/>
+        </w:rPr>
+        <w:br/>
+      </w:r>
+      <w:r>
+        <w:rPr>
+          <w:rFonts w:cs="B Nazanin" w:hint="cs"/>
+          <w:b/>
+          <w:bCs/>
+          <w:sz w:val="40"/>
+          <w:szCs w:val="40"/>
+          <w:rtl/>
+          <w:lang w:bidi="fa-IR"/>
+        </w:rPr>
+        <w:t>تاریخ : 17/06/1405</w:t>
+      </w:r>
+    </w:p>
+    <w:tbl>
+      <w:tblPr>
+        <w:tblStyle w:val="TableGrid"/>
+        <w:tblW w:w="8460" w:type="dxa"/>
+        <w:jc w:val="center"/>
+        <w:tblBorders>
+          <w:top w:val="none" w:sz="0" w:space="0" w:color="auto"/>
+          <w:left w:val="none" w:sz="0" w:space="0" w:color="auto"/>
+          <w:bottom w:val="none" w:sz="0" w:space="0" w:color="auto"/>
+          <w:right w:val="none" w:sz="0" w:space="0" w:color="auto"/>
+          <w:insideH w:val="none" w:sz="0" w:space="0" w:color="auto"/>
+          <w:insideV w:val="none" w:sz="0" w:space="0" w:color="auto"/>
+        </w:tblBorders>
+        <w:tblLayout w:type="fixed"/>
+        <w:tblLook w:val="04A0" w:firstRow="1" w:lastRow="0" w:firstColumn="1" w:lastColumn="0" w:noHBand="0" w:noVBand="1"/>
+      </w:tblPr>
+      <w:tblGrid>
+        <w:gridCol w:w="8460"/>
+      </w:tblGrid>
+      <w:tr>
+        <w:trPr>
+          <w:trHeight w:val="432"/>
+          <w:jc w:val="center"/>
+        </w:trPr>
+        <w:tc>
+          <w:tcPr>
+            <w:tcW w:w="8460" w:type="dxa"/>
+          </w:tcPr>
+          <w:p>
+            <w:pPr>
+              <w:bidi/>
+              <w:jc w:val="both"/>
+              <w:rPr>
+                <w:sz w:val="26"/>
+                <w:szCs w:val="26"/>
+              </w:rPr>
+            </w:pPr>
+            <w:r>
+              <w:br w:type="page"/>
+            </w:r>
+            <w:r>
+              <w:rPr>
+                <w:rFonts w:hint="cs"/>
+                <w:bCs/>
+                <w:sz w:val="28"/>
+                <w:szCs w:val="28"/>
+                <w:rtl/>
+              </w:rPr>
+              <w:t>نام و نام خانوادگي: پوریا زارعی</w:t>
+            </w:r>
+          </w:p>
+        </w:tc>
+      </w:tr>
+      <w:tr>
+        <w:trPr>
+          <w:trHeight w:val="432"/>
+          <w:jc w:val="center"/>
+        </w:trPr>
+        <w:tc>
+          <w:tcPr>
+            <w:tcW w:w="8460" w:type="dxa"/>
+          </w:tcPr>
+          <w:p>
+            <w:pPr>
+              <w:bidi/>
+              <w:jc w:val="both"/>
+              <w:rPr>
+                <w:sz w:val="26"/>
+                <w:szCs w:val="26"/>
+              </w:rPr>
+            </w:pPr>
+            <w:r>
+              <w:rPr>
+                <w:rFonts w:hint="cs"/>
+                <w:bCs/>
+                <w:sz w:val="28"/>
+                <w:szCs w:val="28"/>
+                <w:rtl/>
+              </w:rPr>
+              <w:t>شماره دانشجويي: 810103137</w:t>
+            </w:r>
+          </w:p>
+        </w:tc>
+      </w:tr>
+      <w:tr>
+        <w:trPr>
+          <w:trHeight w:val="432"/>
+          <w:jc w:val="center"/>
+        </w:trPr>
+        <w:tc>
+          <w:tcPr>
+            <w:tcW w:w="8460" w:type="dxa"/>
+          </w:tcPr>
+          <w:p>
+            <w:pPr>
+              <w:bidi/>
+              <w:jc w:val="both"/>
+              <w:rPr>
+                <w:sz w:val="26"/>
+                <w:szCs w:val="26"/>
+              </w:rPr>
+            </w:pPr>
+            <w:r>
+              <w:rPr>
+                <w:rFonts w:hint="cs"/>
+                <w:bCs/>
+                <w:sz w:val="28"/>
+                <w:szCs w:val="28"/>
+                <w:rtl/>
+              </w:rPr>
+              <w:t xml:space="preserve">استاد راهنماي اول: دکتر یزدان پناه </w:t>
+            </w:r>
+          </w:p>
+        </w:tc>
+      </w:tr>
+      <w:tr>
+        <w:trPr>
+          <w:trHeight w:val="432"/>
+          <w:jc w:val="center"/>
+        </w:trPr>
+        <w:tc>
+          <w:tcPr>
+            <w:tcW w:w="8460" w:type="dxa"/>
+          </w:tcPr>
+          <w:p>
+            <w:pPr>
+              <w:bidi/>
+              <w:jc w:val="both"/>
+              <w:rPr>
+                <w:bCs/>
+                <w:sz w:val="28"/>
+                <w:szCs w:val="28"/>
+                <w:rtl/>
+                <w:lang w:bidi="fa-IR"/>
+              </w:rPr>
+            </w:pPr>
+            <w:r>
+              <w:rPr>
+                <w:rFonts w:hint="cs"/>
+                <w:bCs/>
+                <w:sz w:val="28"/>
+                <w:szCs w:val="28"/>
+                <w:rtl/>
+                <w:lang w:bidi="fa-IR"/>
+              </w:rPr>
+              <w:t>تاريخ تصويب:</w:t>
+            </w:r>
+            <w:r>
+              <w:rPr>
+                <w:rFonts w:hint="cs"/>
+                <w:bCs/>
+                <w:sz w:val="28"/>
+                <w:szCs w:val="28"/>
+                <w:rtl/>
+                <w:lang w:bidi="fa-IR"/>
+              </w:rPr>
+              <w:t xml:space="preserve"> 01/12/1404</w:t>
+            </w:r>
+          </w:p>
+          <w:p>
+            <w:pPr>
+              <w:bidi/>
+              <w:jc w:val="both"/>
+              <w:rPr>
+                <w:sz w:val="26"/>
+                <w:szCs w:val="26"/>
+              </w:rPr>
+            </w:pPr>
+          </w:p>
+        </w:tc>
+      </w:tr>
+    </w:tbl>
     <w:p>
       <w:pPr>
         <w:pStyle w:val="Heading1"/>
         <w:jc w:val="center"/>
+        <w:rPr>
+          <w:rFonts w:ascii="B Nazanin" w:hAnsi="B Nazanin" w:cs="B Nazanin"/>
+          <w:rtl/>
+        </w:rPr>
+      </w:pPr>
+    </w:p>
+    <w:p>
+      <w:pPr>
+        <w:rPr>
+          <w:rFonts w:eastAsiaTheme="majorEastAsia" w:cs="B Nazanin"/>
+          <w:b/>
+          <w:bCs/>
+          <w:color w:val="365F91" w:themeColor="accent1" w:themeShade="BF"/>
+          <w:sz w:val="28"/>
+          <w:szCs w:val="28"/>
+          <w:rtl/>
+        </w:rPr>
+      </w:pPr>
+      <w:r>
+        <w:rPr>
+          <w:rFonts w:cs="B Nazanin"/>
+          <w:rtl/>
+        </w:rPr>
+        <w:br w:type="page"/>
+      </w:r>
+    </w:p>
+    <w:p>
+      <w:pPr>
+        <w:pStyle w:val="Heading1"/>
+        <w:jc w:val="center"/>
+        <w:rPr>
+          <w:rFonts w:ascii="B Nazanin" w:hAnsi="B Nazanin" w:cs="B Nazanin"/>
+          <w:rtl/>
+        </w:rPr>
+      </w:pPr>
+    </w:p>
+    <w:p>
+      <w:pPr>
+        <w:pStyle w:val="Heading1"/>
+        <w:jc w:val="center"/>
+        <w:rPr>
+          <w:rFonts w:ascii="B Nazanin" w:hAnsi="B Nazanin" w:cs="B Nazanin"/>
+        </w:rPr>
       </w:pPr>
       <w:r>
         <w:rPr>
@@ -38,15 +714,12 @@
     <w:p>
       <w:pPr>
         <w:pStyle w:val="PersianBody"/>
-        <w:jc w:val="center"/>
-      </w:pPr>
-      <w:r>
+        <w:jc w:val="right"/>
         <w:rPr>
           <w:rFonts w:cs="B Nazanin"/>
           <w:rtl/>
         </w:rPr>
-        <w:t>پوریا زارعی — کارشناسی ارشد مهندسی برق، گرایش کنترل — دانشگاه تهران</w:t>
-      </w:r>
+      </w:pPr>
     </w:p>
     <w:p>
       <w:pPr>
@@ -91,7 +764,6 @@
         <w:rPr>
           <w:rFonts w:cs="B Nazanin"/>
           <w:sz w:val="26"/>
-          <w:rtl/>
         </w:rPr>
       </w:pPr>
       <w:r>
@@ -104,12 +776,6 @@
     </w:p>
     <w:p>
       <w:pPr>
-        <w:pStyle w:val="PersianBody"/>
-        <w:jc w:val="right"/>
-      </w:pPr>
-    </w:p>
-    <w:p>
-      <w:pPr>
         <w:pStyle w:val="Heading2"/>
         <w:jc w:val="right"/>
       </w:pPr>
@@ -118,6 +784,7 @@
           <w:rFonts w:ascii="B Nazanin" w:hAnsi="B Nazanin" w:cs="B Nazanin"/>
           <w:rtl/>
         </w:rPr>
+        <w:lastRenderedPageBreak/>
         <w:t>۱) هدف و تعریف پروژه</w:t>
       </w:r>
     </w:p>
@@ -648,7 +1315,7 @@
                     <pic:cNvPicPr/>
                   </pic:nvPicPr>
                   <pic:blipFill>
-                    <a:blip r:embed="rId8"/>
+                    <a:blip r:embed="rId10"/>
                     <a:stretch>
                       <a:fillRect/>
                     </a:stretch>
@@ -708,7 +1375,7 @@
                     <pic:cNvPicPr/>
                   </pic:nvPicPr>
                   <pic:blipFill>
-                    <a:blip r:embed="rId9"/>
+                    <a:blip r:embed="rId11"/>
                     <a:stretch>
                       <a:fillRect/>
                     </a:stretch>
@@ -769,7 +1436,7 @@
                     <pic:cNvPicPr/>
                   </pic:nvPicPr>
                   <pic:blipFill>
-                    <a:blip r:embed="rId10"/>
+                    <a:blip r:embed="rId12"/>
                     <a:stretch>
                       <a:fillRect/>
                     </a:stretch>
@@ -950,6 +1617,10 @@
       <w:pPr>
         <w:pStyle w:val="PersianBody"/>
         <w:bidi/>
+        <w:rPr>
+          <w:rFonts w:cs="B Nazanin"/>
+          <w:rtl/>
+        </w:rPr>
       </w:pPr>
       <w:r>
         <w:rPr>
@@ -959,9 +1630,56 @@
         <w:t>هدف نهایی این است که یک کنترل‌کننده مبتنی بر یادگیری که تحمل‌پذیر خطاست، اول نشانه‌روی رو به زمین را با دقت حفظ کند، بعد در برابر افت/ازکارافتادن چرخ و خطای سنسور بازیابی شود، به خطاهای دیده‌نشده تعمیم پیدا کند و در نهایت کل زنجیره MIL → SIL → HIL تأیید شود.</w:t>
       </w:r>
     </w:p>
+    <w:p>
+      <w:pPr>
+        <w:rPr>
+          <w:rFonts w:cs="B Nazanin"/>
+          <w:sz w:val="26"/>
+          <w:rtl/>
+        </w:rPr>
+      </w:pPr>
+      <w:r>
+        <w:rPr>
+          <w:rFonts w:cs="B Nazanin"/>
+          <w:rtl/>
+        </w:rPr>
+        <w:br w:type="page"/>
+      </w:r>
+    </w:p>
+    <w:p>
+      <w:pPr>
+        <w:pStyle w:val="Heading1"/>
+        <w:bidi/>
+        <w:rPr>
+          <w:rtl/>
+        </w:rPr>
+      </w:pPr>
+      <w:r>
+        <w:rPr>
+          <w:rFonts w:hint="cs"/>
+          <w:rtl/>
+        </w:rPr>
+        <w:lastRenderedPageBreak/>
+        <w:t>کد ها :</w:t>
+      </w:r>
+    </w:p>
+    <w:p>
+      <w:pPr>
+        <w:bidi/>
+        <w:rPr>
+          <w:rFonts w:asciiTheme="minorHAnsi" w:hAnsiTheme="minorHAnsi"/>
+        </w:rPr>
+      </w:pPr>
+      <w:r>
+        <w:rPr>
+          <w:rFonts w:asciiTheme="minorHAnsi" w:hAnsiTheme="minorHAnsi"/>
+        </w:rPr>
+        <w:t>https://github.com/porya-zarei/Master_Final_Project</w:t>
+      </w:r>
+    </w:p>
     <w:sectPr>
-      <w:headerReference w:type="default" r:id="rId11"/>
-      <w:footerReference w:type="default" r:id="rId12"/>
+      <w:headerReference w:type="default" r:id="rId13"/>
+      <w:footerReference w:type="default" r:id="rId14"/>
       <w:pgSz w:w="11906" w:h="16838"/>
       <w:pgMar w:top="1247" w:right="1134" w:bottom="1247" w:left="1134" w:header="720" w:footer="720" w:gutter="0"/>
       <w:cols w:space="720"/>
@@ -2156,6 +2874,7 @@
   </w:style>
   <w:style w:type="paragraph" w:styleId="NoSpacing">
     <w:name w:val="No Spacing"/>
+    <w:link w:val="NoSpacingChar"/>
     <w:uiPriority w:val="1"/>
     <w:qFormat/>
     <w:rsid w:val="00FC693F"/>
@@ -12888,7 +13607,669 @@
       <w:sz w:val="28"/>
     </w:rPr>
   </w:style>
+  <w:style w:type="character" w:customStyle="1" w:styleId="NoSpacingChar">
+    <w:name w:val="No Spacing Char"/>
+    <w:basedOn w:val="DefaultParagraphFont"/>
+    <w:link w:val="NoSpacing"/>
+    <w:uiPriority w:val="1"/>
+    <w:rsid w:val="00C93087"/>
+  </w:style>
+  <w:style w:type="character" w:customStyle="1" w:styleId="Style1">
+    <w:name w:val="Style1"/>
+    <w:basedOn w:val="DefaultParagraphFont"/>
+    <w:uiPriority w:val="1"/>
+    <w:rsid w:val="00C93087"/>
+    <w:rPr>
+      <w:rFonts w:ascii="B Nazanin" w:hAnsi="B Nazanin"/>
+      <w:sz w:val="24"/>
+    </w:rPr>
+  </w:style>
 </w:styles>
+</file>
+
+<file path=word/glossary/document.xml><?xml version="1.0" encoding="utf-8"?>
+<w:glossaryDocument xmlns:wpc="http://schemas.microsoft.com/office/word/2010/wordprocessingCanvas" xmlns:cx="http://schemas.microsoft.com/office/drawing/2014/chartex" xmlns:cx1="http://schemas.microsoft.com/office/drawing/2015/9/8/chartex" xmlns:cx2="http://schemas.microsoft.com/office/drawing/2015/10/21/chartex" xmlns:cx3="http://schemas.microsoft.com/office/drawing/2016/5/9/chartex" xmlns:cx4="http://schemas.microsoft.com/office/drawing/2016/5/10/chartex" xmlns:cx5="http://schemas.microsoft.com/office/drawing/2016/5/11/chartex" xmlns:cx6="http://schemas.microsoft.com/office/drawing/2016/5/12/chartex" xmlns:cx7="http://schemas.microsoft.com/office/drawing/2016/5/13/chartex" xmlns:cx8="http://schemas.microsoft.com/office/drawing/2016/5/14/chartex" xmlns:mc="http://schemas.openxmlformats.org/markup-compatibility/2006" xmlns:aink="http://schemas.microsoft.com/office/drawing/2016/ink" xmlns:am3d="http://schemas.microsoft.com/office/drawing/2017/model3d" xmlns:o="urn:schemas-microsoft-com:office:office" xmlns:oel="http://schemas.microsoft.com/office/2019/extlst" xmlns:r="http://schemas.openxmlformats.org/officeDocument/2006/relationships" xmlns:m="http://schemas.openxmlformats.org/officeDocument/2006/math" xmlns:v="urn:schemas-microsoft-com:vml" xmlns:wp14="http://schemas.microsoft.com/office/word/2010/wordprocessingDrawing" xmlns:wp="http://schemas.openxmlformats.org/drawingml/2006/wordprocessingDrawing" xmlns:w10="urn:schemas-microsoft-com:office:word" xmlns:w="http://schemas.openxmlformats.org/wordprocessingml/2006/main" xmlns:w14="http://schemas.microsoft.com/office/word/2010/wordml" xmlns:w15="http://schemas.microsoft.com/office/word/2012/wordml" xmlns:w16cex="http://schemas.microsoft.com/office/word/2018/wordml/cex" xmlns:w16cid="http://schemas.microsoft.com/office/word/2016/wordml/cid" xmlns:w16="http://schemas.microsoft.com/office/word/2018/wordml" xmlns:w16du="http://schemas.microsoft.com/office/word/2023/wordml/word16du" xmlns:w16sdtdh="http://schemas.microsoft.com/office/word/2020/wordml/sdtdatahash" xmlns:w16sdtfl="http://schemas.microsoft.com/office/word/2024/wordml/sdtformatlock" xmlns:w16se="http://schemas.microsoft.com/office/word/2015/wordml/symex" xmlns:wpg="http://schemas.microsoft.com/office/word/2010/wordprocessingGroup" xmlns:wpi="http://schemas.microsoft.com/office/word/2010/wordprocessingInk" xmlns:wne="http://schemas.microsoft.com/office/word/2006/wordml" xmlns:wps="http://schemas.microsoft.com/office/word/2010/wordprocessingShape" mc:Ignorable="w14 w15 w16se w16cid w16 w16cex w16sdtdh w16sdtfl w16du wp14">
+  <w:docParts>
+    <w:docPart>
+      <w:docPartPr>
+        <w:name w:val="28E4DCBA4D614B94A8A69633A5BBB639"/>
+        <w:category>
+          <w:name w:val="General"/>
+          <w:gallery w:val="placeholder"/>
+        </w:category>
+        <w:types>
+          <w:type w:val="bbPlcHdr"/>
+        </w:types>
+        <w:behaviors>
+          <w:behavior w:val="content"/>
+        </w:behaviors>
+        <w:guid w:val="{D963DA39-86E6-4763-9FAC-CC815874783D}"/>
+      </w:docPartPr>
+      <w:docPartBody>
+        <w:p>
+          <w:pPr>
+            <w:pStyle w:val="28E4DCBA4D614B94A8A69633A5BBB639"/>
+          </w:pPr>
+          <w:r>
+            <w:rPr>
+              <w:rStyle w:val="PlaceholderText"/>
+              <w:rFonts w:cs="B Nazanin" w:hint="cs"/>
+              <w:bCs/>
+              <w:color w:val="0000FF"/>
+              <w:sz w:val="32"/>
+              <w:szCs w:val="32"/>
+              <w:u w:val="single"/>
+              <w:rtl/>
+            </w:rPr>
+            <w:t>انتخاب نماييد</w:t>
+          </w:r>
+        </w:p>
+      </w:docPartBody>
+    </w:docPart>
+  </w:docParts>
+</w:glossaryDocument>
+</file>
+
+<file path=word/glossary/fontTable.xml><?xml version="1.0" encoding="utf-8"?>
+<w:fonts xmlns:mc="http://schemas.openxmlformats.org/markup-compatibility/2006" xmlns:r="http://schemas.openxmlformats.org/officeDocument/2006/relationships" xmlns:w="http://schemas.openxmlformats.org/wordprocessingml/2006/main" xmlns:w14="http://schemas.microsoft.com/office/word/2010/wordml" xmlns:w15="http://schemas.microsoft.com/office/word/2012/wordml" xmlns:w16cex="http://schemas.microsoft.com/office/word/2018/wordml/cex" xmlns:w16cid="http://schemas.microsoft.com/office/word/2016/wordml/cid" xmlns:w16="http://schemas.microsoft.com/office/word/2018/wordml" xmlns:w16du="http://schemas.microsoft.com/office/word/2023/wordml/word16du" xmlns:w16sdtdh="http://schemas.microsoft.com/office/word/2020/wordml/sdtdatahash" xmlns:w16sdtfl="http://schemas.microsoft.com/office/word/2024/wordml/sdtformatlock" xmlns:w16se="http://schemas.microsoft.com/office/word/2015/wordml/symex" mc:Ignorable="w14 w15 w16se w16cid w16 w16cex w16sdtdh w16sdtfl w16du">
+  <w:font w:name="Symbol">
+    <w:panose1 w:val="05050102010706020507"/>
+    <w:charset w:val="02"/>
+    <w:family w:val="roman"/>
+    <w:pitch w:val="variable"/>
+    <w:sig w:usb0="00000000" w:usb1="10000000" w:usb2="00000000" w:usb3="00000000" w:csb0="80000000" w:csb1="00000000"/>
+  </w:font>
+  <w:font w:name="Times New Roman">
+    <w:panose1 w:val="02020603050405020304"/>
+    <w:charset w:val="00"/>
+    <w:family w:val="roman"/>
+    <w:pitch w:val="variable"/>
+    <w:sig w:usb0="E0002EFF" w:usb1="C000785B" w:usb2="00000009" w:usb3="00000000" w:csb0="000001FF" w:csb1="00000000"/>
+  </w:font>
+  <w:font w:name="Courier New">
+    <w:panose1 w:val="02070309020205020404"/>
+    <w:charset w:val="00"/>
+    <w:family w:val="modern"/>
+    <w:pitch w:val="fixed"/>
+    <w:sig w:usb0="E0002EFF" w:usb1="C0007843" w:usb2="00000009" w:usb3="00000000" w:csb0="000001FF" w:csb1="00000000"/>
+  </w:font>
+  <w:font w:name="Wingdings">
+    <w:panose1 w:val="05000000000000000000"/>
+    <w:charset w:val="02"/>
+    <w:family w:val="auto"/>
+    <w:pitch w:val="variable"/>
+    <w:sig w:usb0="00000000" w:usb1="10000000" w:usb2="00000000" w:usb3="00000000" w:csb0="80000000" w:csb1="00000000"/>
+  </w:font>
+  <w:font w:name="Cambria">
+    <w:panose1 w:val="02040503050406030204"/>
+    <w:charset w:val="00"/>
+    <w:family w:val="roman"/>
+    <w:pitch w:val="variable"/>
+    <w:sig w:usb0="E00006FF" w:usb1="420024FF" w:usb2="02000000" w:usb3="00000000" w:csb0="0000019F" w:csb1="00000000"/>
+  </w:font>
+  <w:font w:name="MS Mincho">
+    <w:panose1 w:val="02020609040205080304"/>
+    <w:charset w:val="80"/>
+    <w:family w:val="modern"/>
+    <w:pitch w:val="fixed"/>
+    <w:sig w:usb0="E00002FF" w:usb1="6AC7FDFB" w:usb2="08000012" w:usb3="00000000" w:csb0="0002009F" w:csb1="00000000"/>
+  </w:font>
+  <w:font w:name="Arial">
+    <w:panose1 w:val="020B0604020202020204"/>
+    <w:charset w:val="00"/>
+    <w:family w:val="swiss"/>
+    <w:pitch w:val="variable"/>
+    <w:sig w:usb0="E0002EFF" w:usb1="C000785B" w:usb2="00000009" w:usb3="00000000" w:csb0="000001FF" w:csb1="00000000"/>
+  </w:font>
+  <w:font w:name="B Nazanin">
+    <w:altName w:val="Arial"/>
+    <w:charset w:val="B2"/>
+    <w:family w:val="auto"/>
+    <w:pitch w:val="variable"/>
+    <w:sig w:usb0="00002001" w:usb1="80000000" w:usb2="00000008" w:usb3="00000000" w:csb0="00000040" w:csb1="00000000"/>
+  </w:font>
+  <w:font w:name="Calibri">
+    <w:panose1 w:val="020F0502020204030204"/>
+    <w:charset w:val="00"/>
+    <w:family w:val="swiss"/>
+    <w:pitch w:val="variable"/>
+    <w:sig w:usb0="E4002EFF" w:usb1="C200247B" w:usb2="00000009" w:usb3="00000000" w:csb0="000001FF" w:csb1="00000000"/>
+  </w:font>
+  <w:font w:name="MS Gothic">
+    <w:altName w:val="ＭＳ ゴシック"/>
+    <w:panose1 w:val="020B0609070205080204"/>
+    <w:charset w:val="80"/>
+    <w:family w:val="modern"/>
+    <w:pitch w:val="fixed"/>
+    <w:sig w:usb0="E00002FF" w:usb1="6AC7FDFB" w:usb2="08000012" w:usb3="00000000" w:csb0="0002009F" w:csb1="00000000"/>
+  </w:font>
+  <w:font w:name="Courier">
+    <w:panose1 w:val="02070409020205020404"/>
+    <w:charset w:val="00"/>
+    <w:family w:val="auto"/>
+    <w:pitch w:val="variable"/>
+    <w:sig w:usb0="00000003" w:usb1="00000000" w:usb2="00000000" w:usb3="00000000" w:csb0="00000001" w:csb1="00000000"/>
+  </w:font>
+  <w:font w:name="Aptos">
+    <w:charset w:val="00"/>
+    <w:family w:val="swiss"/>
+    <w:pitch w:val="variable"/>
+    <w:sig w:usb0="20000287" w:usb1="00000003" w:usb2="00000000" w:usb3="00000000" w:csb0="0000019F" w:csb1="00000000"/>
+  </w:font>
+  <w:font w:name="Aptos Display">
+    <w:charset w:val="00"/>
+    <w:family w:val="swiss"/>
+    <w:pitch w:val="variable"/>
+    <w:sig w:usb0="20000287" w:usb1="00000003" w:usb2="00000000" w:usb3="00000000" w:csb0="0000019F" w:csb1="00000000"/>
+  </w:font>
+</w:fonts>
+</file>
+
+<file path=word/glossary/settings.xml><?xml version="1.0" encoding="utf-8"?>
+<w:settings xmlns:mc="http://schemas.openxmlformats.org/markup-compatibility/2006" xmlns:o="urn:schemas-microsoft-com:office:office" xmlns:r="http://schemas.openxmlformats.org/officeDocument/2006/relationships" xmlns:m="http://schemas.openxmlformats.org/officeDocument/2006/math" xmlns:v="urn:schemas-microsoft-com:vml" xmlns:w10="urn:schemas-microsoft-com:office:word" xmlns:w="http://schemas.openxmlformats.org/wordprocessingml/2006/main" xmlns:w14="http://schemas.microsoft.com/office/word/2010/wordml" xmlns:w15="http://schemas.microsoft.com/office/word/2012/wordml" xmlns:w16cex="http://schemas.microsoft.com/office/word/2018/wordml/cex" xmlns:w16cid="http://schemas.microsoft.com/office/word/2016/wordml/cid" xmlns:w16="http://schemas.microsoft.com/office/word/2018/wordml" xmlns:w16du="http://schemas.microsoft.com/office/word/2023/wordml/word16du" xmlns:w16sdtdh="http://schemas.microsoft.com/office/word/2020/wordml/sdtdatahash" xmlns:w16sdtfl="http://schemas.microsoft.com/office/word/2024/wordml/sdtformatlock" xmlns:w16se="http://schemas.microsoft.com/office/word/2015/wordml/symex" xmlns:sl="http://schemas.openxmlformats.org/schemaLibrary/2006/main" mc:Ignorable="w14 w15 w16se w16cid w16 w16cex w16sdtdh w16sdtfl w16du">
+  <w:view w:val="normal"/>
+  <w:defaultTabStop w:val="720"/>
+  <w:characterSpacingControl w:val="doNotCompress"/>
+  <w:compat>
+    <w:useFELayout/>
+    <w:compatSetting w:name="compatibilityMode" w:uri="http://schemas.microsoft.com/office/word" w:val="15"/>
+    <w:compatSetting w:name="overrideTableStyleFontSizeAndJustification" w:uri="http://schemas.microsoft.com/office/word" w:val="1"/>
+    <w:compatSetting w:name="enableOpenTypeFeatures" w:uri="http://schemas.microsoft.com/office/word" w:val="1"/>
+    <w:compatSetting w:name="doNotFlipMirrorIndents" w:uri="http://schemas.microsoft.com/office/word" w:val="1"/>
+    <w:compatSetting w:name="differentiateMultirowTableHeaders" w:uri="http://schemas.microsoft.com/office/word" w:val="1"/>
+    <w:compatSetting w:name="useWord2013TrackBottomHyphenation" w:uri="http://schemas.microsoft.com/office/word" w:val="0"/>
+  </w:compat>
+  <w:rsids>
+    <w:rsidRoot w:val="00ED2926"/>
+    <w:rsid w:val="002461D3"/>
+    <w:rsid w:val="009631C2"/>
+    <w:rsid w:val="00ED2926"/>
+  </w:rsids>
+  <m:mathPr>
+    <m:mathFont m:val="Cambria Math"/>
+    <m:brkBin m:val="before"/>
+    <m:brkBinSub m:val="--"/>
+    <m:smallFrac m:val="0"/>
+    <m:dispDef/>
+    <m:lMargin m:val="0"/>
+    <m:rMargin m:val="0"/>
+    <m:defJc m:val="centerGroup"/>
+    <m:wrapIndent m:val="1440"/>
+    <m:intLim m:val="subSup"/>
+    <m:naryLim m:val="undOvr"/>
+  </m:mathPr>
+  <w:themeFontLang w:val="en-US" w:bidi="ar-SA"/>
+  <w:clrSchemeMapping w:bg1="light1" w:t1="dark1" w:bg2="light2" w:t2="dark2" w:accent1="accent1" w:accent2="accent2" w:accent3="accent3" w:accent4="accent4" w:accent5="accent5" w:accent6="accent6" w:hyperlink="hyperlink" w:followedHyperlink="followedHyperlink"/>
+  <w:decimalSymbol w:val="."/>
+  <w:listSeparator w:val=","/>
+  <w15:chartTrackingRefBased/>
+</w:settings>
+</file>
+
+<file path=word/glossary/styles.xml><?xml version="1.0" encoding="utf-8"?>
+<w:styles xmlns:mc="http://schemas.openxmlformats.org/markup-compatibility/2006" xmlns:r="http://schemas.openxmlformats.org/officeDocument/2006/relationships" xmlns:w="http://schemas.openxmlformats.org/wordprocessingml/2006/main" xmlns:w14="http://schemas.microsoft.com/office/word/2010/wordml" xmlns:w15="http://schemas.microsoft.com/office/word/2012/wordml" xmlns:w16cex="http://schemas.microsoft.com/office/word/2018/wordml/cex" xmlns:w16cid="http://schemas.microsoft.com/office/word/2016/wordml/cid" xmlns:w16="http://schemas.microsoft.com/office/word/2018/wordml" xmlns:w16du="http://schemas.microsoft.com/office/word/2023/wordml/word16du" xmlns:w16sdtdh="http://schemas.microsoft.com/office/word/2020/wordml/sdtdatahash" xmlns:w16sdtfl="http://schemas.microsoft.com/office/word/2024/wordml/sdtformatlock" xmlns:w16se="http://schemas.microsoft.com/office/word/2015/wordml/symex" mc:Ignorable="w14 w15 w16se w16cid w16 w16cex w16sdtdh w16sdtfl w16du">
+  <w:docDefaults>
+    <w:rPrDefault>
+      <w:rPr>
+        <w:rFonts w:asciiTheme="minorHAnsi" w:eastAsiaTheme="minorEastAsia" w:hAnsiTheme="minorHAnsi" w:cstheme="minorBidi"/>
+        <w:kern w:val="2"/>
+        <w:sz w:val="24"/>
+        <w:szCs w:val="24"/>
+        <w:lang w:val="en-US" w:eastAsia="en-US" w:bidi="ar-SA"/>
+        <w14:ligatures w14:val="standardContextual"/>
+      </w:rPr>
+    </w:rPrDefault>
+    <w:pPrDefault>
+      <w:pPr>
+        <w:spacing w:after="160" w:line="278" w:lineRule="auto"/>
+      </w:pPr>
+    </w:pPrDefault>
+  </w:docDefaults>
+  <w:latentStyles w:defLockedState="0" w:defUIPriority="99" w:defSemiHidden="0" w:defUnhideWhenUsed="0" w:defQFormat="0" w:count="376">
+    <w:lsdException w:name="Normal" w:uiPriority="0" w:qFormat="1"/>
+    <w:lsdException w:name="heading 1" w:uiPriority="9" w:qFormat="1"/>
+    <w:lsdException w:name="heading 2" w:semiHidden="1" w:uiPriority="9" w:unhideWhenUsed="1" w:qFormat="1"/>
+    <w:lsdException w:name="heading 3" w:semiHidden="1" w:uiPriority="9" w:unhideWhenUsed="1" w:qFormat="1"/>
+    <w:lsdException w:name="heading 4" w:semiHidden="1" w:uiPriority="9" w:unhideWhenUsed="1" w:qFormat="1"/>
+    <w:lsdException w:name="heading 5" w:semiHidden="1" w:uiPriority="9" w:unhideWhenUsed="1" w:qFormat="1"/>
+    <w:lsdException w:name="heading 6" w:semiHidden="1" w:uiPriority="9" w:unhideWhenUsed="1" w:qFormat="1"/>
+    <w:lsdException w:name="heading 7" w:semiHidden="1" w:uiPriority="9" w:unhideWhenUsed="1" w:qFormat="1"/>
+    <w:lsdException w:name="heading 8" w:semiHidden="1" w:uiPriority="9" w:unhideWhenUsed="1" w:qFormat="1"/>
+    <w:lsdException w:name="heading 9" w:semiHidden="1" w:uiPriority="9" w:unhideWhenUsed="1" w:qFormat="1"/>
+    <w:lsdException w:name="index 1" w:semiHidden="1" w:unhideWhenUsed="1"/>
+    <w:lsdException w:name="index 2" w:semiHidden="1" w:unhideWhenUsed="1"/>
+    <w:lsdException w:name="index 3" w:semiHidden="1" w:unhideWhenUsed="1"/>
+    <w:lsdException w:name="index 4" w:semiHidden="1" w:unhideWhenUsed="1"/>
+    <w:lsdException w:name="index 5" w:semiHidden="1" w:unhideWhenUsed="1"/>
+    <w:lsdException w:name="index 6" w:semiHidden="1" w:unhideWhenUsed="1"/>
+    <w:lsdException w:name="index 7" w:semiHidden="1" w:unhideWhenUsed="1"/>
+    <w:lsdException w:name="index 8" w:semiHidden="1" w:unhideWhenUsed="1"/>
+    <w:lsdException w:name="index 9" w:semiHidden="1" w:unhideWhenUsed="1"/>
+    <w:lsdException w:name="toc 1" w:semiHidden="1" w:uiPriority="39" w:unhideWhenUsed="1"/>
+    <w:lsdException w:name="toc 2" w:semiHidden="1" w:uiPriority="39" w:unhideWhenUsed="1"/>
+    <w:lsdException w:name="toc 3" w:semiHidden="1" w:uiPriority="39" w:unhideWhenUsed="1"/>
+    <w:lsdException w:name="toc 4" w:semiHidden="1" w:uiPriority="39" w:unhideWhenUsed="1"/>
+    <w:lsdException w:name="toc 5" w:semiHidden="1" w:uiPriority="39" w:unhideWhenUsed="1"/>
+    <w:lsdException w:name="toc 6" w:semiHidden="1" w:uiPriority="39" w:unhideWhenUsed="1"/>
+    <w:lsdException w:name="toc 7" w:semiHidden="1" w:uiPriority="39" w:unhideWhenUsed="1"/>
+    <w:lsdException w:name="toc 8" w:semiHidden="1" w:uiPriority="39" w:unhideWhenUsed="1"/>
+    <w:lsdException w:name="toc 9" w:semiHidden="1" w:uiPriority="39" w:unhideWhenUsed="1"/>
+    <w:lsdException w:name="Normal Indent" w:semiHidden="1" w:unhideWhenUsed="1"/>
+    <w:lsdException w:name="footnote text" w:semiHidden="1" w:unhideWhenUsed="1"/>
+    <w:lsdException w:name="annotation text" w:semiHidden="1" w:unhideWhenUsed="1"/>
+    <w:lsdException w:name="header" w:semiHidden="1" w:unhideWhenUsed="1"/>
+    <w:lsdException w:name="footer" w:semiHidden="1" w:unhideWhenUsed="1"/>
+    <w:lsdException w:name="index heading" w:semiHidden="1" w:unhideWhenUsed="1"/>
+    <w:lsdException w:name="caption" w:semiHidden="1" w:uiPriority="35" w:unhideWhenUsed="1" w:qFormat="1"/>
+    <w:lsdException w:name="table of figures" w:semiHidden="1" w:unhideWhenUsed="1"/>
+    <w:lsdException w:name="envelope address" w:semiHidden="1" w:unhideWhenUsed="1"/>
+    <w:lsdException w:name="envelope return" w:semiHidden="1" w:unhideWhenUsed="1"/>
+    <w:lsdException w:name="footnote reference" w:semiHidden="1" w:unhideWhenUsed="1"/>
+    <w:lsdException w:name="annotation reference" w:semiHidden="1" w:unhideWhenUsed="1"/>
+    <w:lsdException w:name="line number" w:semiHidden="1" w:unhideWhenUsed="1"/>
+    <w:lsdException w:name="page number" w:semiHidden="1" w:unhideWhenUsed="1"/>
+    <w:lsdException w:name="endnote reference" w:semiHidden="1" w:unhideWhenUsed="1"/>
+    <w:lsdException w:name="endnote text" w:semiHidden="1" w:unhideWhenUsed="1"/>
+    <w:lsdException w:name="table of authorities" w:semiHidden="1" w:unhideWhenUsed="1"/>
+    <w:lsdException w:name="macro" w:semiHidden="1" w:unhideWhenUsed="1"/>
+    <w:lsdException w:name="toa heading" w:semiHidden="1" w:unhideWhenUsed="1"/>
+    <w:lsdException w:name="List" w:semiHidden="1" w:unhideWhenUsed="1"/>
+    <w:lsdException w:name="List Bullet" w:semiHidden="1" w:unhideWhenUsed="1"/>
+    <w:lsdException w:name="List Number" w:semiHidden="1" w:unhideWhenUsed="1"/>
+    <w:lsdException w:name="List 2" w:semiHidden="1" w:unhideWhenUsed="1"/>
+    <w:lsdException w:name="List 3" w:semiHidden="1" w:unhideWhenUsed="1"/>
+    <w:lsdException w:name="List 4" w:semiHidden="1" w:unhideWhenUsed="1"/>
+    <w:lsdException w:name="List 5" w:semiHidden="1" w:unhideWhenUsed="1"/>
+    <w:lsdException w:name="List Bullet 2" w:semiHidden="1" w:unhideWhenUsed="1"/>
+    <w:lsdException w:name="List Bullet 3" w:semiHidden="1" w:unhideWhenUsed="1"/>
+    <w:lsdException w:name="List Bullet 4" w:semiHidden="1" w:unhideWhenUsed="1"/>
+    <w:lsdException w:name="List Bullet 5" w:semiHidden="1" w:unhideWhenUsed="1"/>
+    <w:lsdException w:name="List Number 2" w:semiHidden="1" w:unhideWhenUsed="1"/>
+    <w:lsdException w:name="List Number 3" w:semiHidden="1" w:unhideWhenUsed="1"/>
+    <w:lsdException w:name="List Number 4" w:semiHidden="1" w:unhideWhenUsed="1"/>
+    <w:lsdException w:name="List Number 5" w:semiHidden="1" w:unhideWhenUsed="1"/>
+    <w:lsdException w:name="Title" w:uiPriority="10" w:qFormat="1"/>
+    <w:lsdException w:name="Closing" w:semiHidden="1" w:unhideWhenUsed="1"/>
+    <w:lsdException w:name="Signature" w:semiHidden="1" w:unhideWhenUsed="1"/>
+    <w:lsdException w:name="Default Paragraph Font" w:semiHidden="1" w:uiPriority="1" w:unhideWhenUsed="1"/>
+    <w:lsdException w:name="Body Text" w:semiHidden="1" w:unhideWhenUsed="1"/>
+    <w:lsdException w:name="Body Text Indent" w:semiHidden="1" w:unhideWhenUsed="1"/>
+    <w:lsdException w:name="List Continue" w:semiHidden="1" w:unhideWhenUsed="1"/>
+    <w:lsdException w:name="List Continue 2" w:semiHidden="1" w:unhideWhenUsed="1"/>
+    <w:lsdException w:name="List Continue 3" w:semiHidden="1" w:unhideWhenUsed="1"/>
+    <w:lsdException w:name="List Continue 4" w:semiHidden="1" w:unhideWhenUsed="1"/>
+    <w:lsdException w:name="List Continue 5" w:semiHidden="1" w:unhideWhenUsed="1"/>
+    <w:lsdException w:name="Message Header" w:semiHidden="1" w:unhideWhenUsed="1"/>
+    <w:lsdException w:name="Subtitle" w:uiPriority="11" w:qFormat="1"/>
+    <w:lsdException w:name="Salutation" w:semiHidden="1" w:unhideWhenUsed="1"/>
+    <w:lsdException w:name="Date" w:semiHidden="1" w:unhideWhenUsed="1"/>
+    <w:lsdException w:name="Body Text First Indent" w:semiHidden="1" w:unhideWhenUsed="1"/>
+    <w:lsdException w:name="Body Text First Indent 2" w:semiHidden="1" w:unhideWhenUsed="1"/>
+    <w:lsdException w:name="Note Heading" w:semiHidden="1" w:unhideWhenUsed="1"/>
+    <w:lsdException w:name="Body Text 2" w:semiHidden="1" w:unhideWhenUsed="1"/>
+    <w:lsdException w:name="Body Text 3" w:semiHidden="1" w:unhideWhenUsed="1"/>
+    <w:lsdException w:name="Body Text Indent 2" w:semiHidden="1" w:unhideWhenUsed="1"/>
+    <w:lsdException w:name="Body Text Indent 3" w:semiHidden="1" w:unhideWhenUsed="1"/>
+    <w:lsdException w:name="Block Text" w:semiHidden="1" w:unhideWhenUsed="1"/>
+    <w:lsdException w:name="Hyperlink" w:semiHidden="1" w:unhideWhenUsed="1"/>
+    <w:lsdException w:name="FollowedHyperlink" w:semiHidden="1" w:unhideWhenUsed="1"/>
+    <w:lsdException w:name="Strong" w:uiPriority="22" w:qFormat="1"/>
+    <w:lsdException w:name="Emphasis" w:uiPriority="20" w:qFormat="1"/>
+    <w:lsdException w:name="Document Map" w:semiHidden="1" w:unhideWhenUsed="1"/>
+    <w:lsdException w:name="Plain Text" w:semiHidden="1" w:unhideWhenUsed="1"/>
+    <w:lsdException w:name="E-mail Signature" w:semiHidden="1" w:unhideWhenUsed="1"/>
+    <w:lsdException w:name="HTML Top of Form" w:semiHidden="1" w:unhideWhenUsed="1"/>
+    <w:lsdException w:name="HTML Bottom of Form" w:semiHidden="1" w:unhideWhenUsed="1"/>
+    <w:lsdException w:name="Normal (Web)" w:semiHidden="1" w:unhideWhenUsed="1"/>
+    <w:lsdException w:name="HTML Acronym" w:semiHidden="1" w:unhideWhenUsed="1"/>
+    <w:lsdException w:name="HTML Address" w:semiHidden="1" w:unhideWhenUsed="1"/>
+    <w:lsdException w:name="HTML Cite" w:semiHidden="1" w:unhideWhenUsed="1"/>
+    <w:lsdException w:name="HTML Code" w:semiHidden="1" w:unhideWhenUsed="1"/>
+    <w:lsdException w:name="HTML Definition" w:semiHidden="1" w:unhideWhenUsed="1"/>
+    <w:lsdException w:name="HTML Keyboard" w:semiHidden="1" w:unhideWhenUsed="1"/>
+    <w:lsdException w:name="HTML Preformatted" w:semiHidden="1" w:unhideWhenUsed="1"/>
+    <w:lsdException w:name="HTML Sample" w:semiHidden="1" w:unhideWhenUsed="1"/>
+    <w:lsdException w:name="HTML Typewriter" w:semiHidden="1" w:unhideWhenUsed="1"/>
+    <w:lsdException w:name="HTML Variable" w:semiHidden="1" w:unhideWhenUsed="1"/>
+    <w:lsdException w:name="Normal Table" w:semiHidden="1" w:unhideWhenUsed="1"/>
+    <w:lsdException w:name="annotation subject" w:semiHidden="1" w:unhideWhenUsed="1"/>
+    <w:lsdException w:name="No List" w:semiHidden="1" w:unhideWhenUsed="1"/>
+    <w:lsdException w:name="Outline List 1" w:semiHidden="1" w:unhideWhenUsed="1"/>
+    <w:lsdException w:name="Outline List 2" w:semiHidden="1" w:unhideWhenUsed="1"/>
+    <w:lsdException w:name="Outline List 3" w:semiHidden="1" w:unhideWhenUsed="1"/>
+    <w:lsdException w:name="Table Simple 1" w:semiHidden="1" w:unhideWhenUsed="1"/>
+    <w:lsdException w:name="Table Simple 2" w:semiHidden="1" w:unhideWhenUsed="1"/>
+    <w:lsdException w:name="Table Simple 3" w:semiHidden="1" w:unhideWhenUsed="1"/>
+    <w:lsdException w:name="Table Classic 1" w:semiHidden="1" w:unhideWhenUsed="1"/>
+    <w:lsdException w:name="Table Classic 2" w:semiHidden="1" w:unhideWhenUsed="1"/>
+    <w:lsdException w:name="Table Classic 3" w:semiHidden="1" w:unhideWhenUsed="1"/>
+    <w:lsdException w:name="Table Classic 4" w:semiHidden="1" w:unhideWhenUsed="1"/>
+    <w:lsdException w:name="Table Colorful 1" w:semiHidden="1" w:unhideWhenUsed="1"/>
+    <w:lsdException w:name="Table Colorful 2" w:semiHidden="1" w:unhideWhenUsed="1"/>
+    <w:lsdException w:name="Table Colorful 3" w:semiHidden="1" w:unhideWhenUsed="1"/>
+    <w:lsdException w:name="Table Columns 1" w:semiHidden="1" w:unhideWhenUsed="1"/>
+    <w:lsdException w:name="Table Columns 2" w:semiHidden="1" w:unhideWhenUsed="1"/>
+    <w:lsdException w:name="Table Columns 3" w:semiHidden="1" w:unhideWhenUsed="1"/>
+    <w:lsdException w:name="Table Columns 4" w:semiHidden="1" w:unhideWhenUsed="1"/>
+    <w:lsdException w:name="Table Columns 5" w:semiHidden="1" w:unhideWhenUsed="1"/>
+    <w:lsdException w:name="Table Grid 1" w:semiHidden="1" w:unhideWhenUsed="1"/>
+    <w:lsdException w:name="Table Grid 2" w:semiHidden="1" w:unhideWhenUsed="1"/>
+    <w:lsdException w:name="Table Grid 3" w:semiHidden="1" w:unhideWhenUsed="1"/>
+    <w:lsdException w:name="Table Grid 4" w:semiHidden="1" w:unhideWhenUsed="1"/>
+    <w:lsdException w:name="Table Grid 5" w:semiHidden="1" w:unhideWhenUsed="1"/>
+    <w:lsdException w:name="Table Grid 6" w:semiHidden="1" w:unhideWhenUsed="1"/>
+    <w:lsdException w:name="Table Grid 7" w:semiHidden="1" w:unhideWhenUsed="1"/>
+    <w:lsdException w:name="Table Grid 8" w:semiHidden="1" w:unhideWhenUsed="1"/>
+    <w:lsdException w:name="Table List 1" w:semiHidden="1" w:unhideWhenUsed="1"/>
+    <w:lsdException w:name="Table List 2" w:semiHidden="1" w:unhideWhenUsed="1"/>
+    <w:lsdException w:name="Table List 3" w:semiHidden="1" w:unhideWhenUsed="1"/>
+    <w:lsdException w:name="Table List 4" w:semiHidden="1" w:unhideWhenUsed="1"/>
+    <w:lsdException w:name="Table List 5" w:semiHidden="1" w:unhideWhenUsed="1"/>
+    <w:lsdException w:name="Table List 6" w:semiHidden="1" w:unhideWhenUsed="1"/>
+    <w:lsdException w:name="Table List 7" w:semiHidden="1" w:unhideWhenUsed="1"/>
+    <w:lsdException w:name="Table List 8" w:semiHidden="1" w:unhideWhenUsed="1"/>
+    <w:lsdException w:name="Table 3D effects 1" w:semiHidden="1" w:unhideWhenUsed="1"/>
+    <w:lsdException w:name="Table 3D effects 2" w:semiHidden="1" w:unhideWhenUsed="1"/>
+    <w:lsdException w:name="Table 3D effects 3" w:semiHidden="1" w:unhideWhenUsed="1"/>
+    <w:lsdException w:name="Table Contemporary" w:semiHidden="1" w:unhideWhenUsed="1"/>
+    <w:lsdException w:name="Table Elegant" w:semiHidden="1" w:unhideWhenUsed="1"/>
+    <w:lsdException w:name="Table Professional" w:semiHidden="1" w:unhideWhenUsed="1"/>
+    <w:lsdException w:name="Table Subtle 1" w:semiHidden="1" w:unhideWhenUsed="1"/>
+    <w:lsdException w:name="Table Subtle 2" w:semiHidden="1" w:unhideWhenUsed="1"/>
+    <w:lsdException w:name="Table Web 1" w:semiHidden="1" w:unhideWhenUsed="1"/>
+    <w:lsdException w:name="Table Web 2" w:semiHidden="1" w:unhideWhenUsed="1"/>
+    <w:lsdException w:name="Table Web 3" w:semiHidden="1" w:unhideWhenUsed="1"/>
+    <w:lsdException w:name="Balloon Text" w:semiHidden="1" w:unhideWhenUsed="1"/>
+    <w:lsdException w:name="Table Grid" w:uiPriority="39"/>
+    <w:lsdException w:name="Table Theme" w:semiHidden="1" w:unhideWhenUsed="1"/>
+    <w:lsdException w:name="Placeholder Text" w:semiHidden="1"/>
+    <w:lsdException w:name="No Spacing" w:uiPriority="1" w:qFormat="1"/>
+    <w:lsdException w:name="Light Shading" w:uiPriority="60"/>
+    <w:lsdException w:name="Light List" w:uiPriority="61"/>
+    <w:lsdException w:name="Light Grid" w:uiPriority="62"/>
+    <w:lsdException w:name="Medium Shading 1" w:uiPriority="63"/>
+    <w:lsdException w:name="Medium Shading 2" w:uiPriority="64"/>
+    <w:lsdException w:name="Medium List 1" w:uiPriority="65"/>
+    <w:lsdException w:name="Medium List 2" w:uiPriority="66"/>
+    <w:lsdException w:name="Medium Grid 1" w:uiPriority="67"/>
+    <w:lsdException w:name="Medium Grid 2" w:uiPriority="68"/>
+    <w:lsdException w:name="Medium Grid 3" w:uiPriority="69"/>
+    <w:lsdException w:name="Dark List" w:uiPriority="70"/>
+    <w:lsdException w:name="Colorful Shading" w:uiPriority="71"/>
+    <w:lsdException w:name="Colorful List" w:uiPriority="72"/>
+    <w:lsdException w:name="Colorful Grid" w:uiPriority="73"/>
+    <w:lsdException w:name="Light Shading Accent 1" w:uiPriority="60"/>
+    <w:lsdException w:name="Light List Accent 1" w:uiPriority="61"/>
+    <w:lsdException w:name="Light Grid Accent 1" w:uiPriority="62"/>
+    <w:lsdException w:name="Medium Shading 1 Accent 1" w:uiPriority="63"/>
+    <w:lsdException w:name="Medium Shading 2 Accent 1" w:uiPriority="64"/>
+    <w:lsdException w:name="Medium List 1 Accent 1" w:uiPriority="65"/>
+    <w:lsdException w:name="Revision" w:semiHidden="1"/>
+    <w:lsdException w:name="List Paragraph" w:uiPriority="34" w:qFormat="1"/>
+    <w:lsdException w:name="Quote" w:uiPriority="29" w:qFormat="1"/>
+    <w:lsdException w:name="Intense Quote" w:uiPriority="30" w:qFormat="1"/>
+    <w:lsdException w:name="Medium List 2 Accent 1" w:uiPriority="66"/>
+    <w:lsdException w:name="Medium Grid 1 Accent 1" w:uiPriority="67"/>
+    <w:lsdException w:name="Medium Grid 2 Accent 1" w:uiPriority="68"/>
+    <w:lsdException w:name="Medium Grid 3 Accent 1" w:uiPriority="69"/>
+    <w:lsdException w:name="Dark List Accent 1" w:uiPriority="70"/>
+    <w:lsdException w:name="Colorful Shading Accent 1" w:uiPriority="71"/>
+    <w:lsdException w:name="Colorful List Accent 1" w:uiPriority="72"/>
+    <w:lsdException w:name="Colorful Grid Accent 1" w:uiPriority="73"/>
+    <w:lsdException w:name="Light Shading Accent 2" w:uiPriority="60"/>
+    <w:lsdException w:name="Light List Accent 2" w:uiPriority="61"/>
+    <w:lsdException w:name="Light Grid Accent 2" w:uiPriority="62"/>
+    <w:lsdException w:name="Medium Shading 1 Accent 2" w:uiPriority="63"/>
+    <w:lsdException w:name="Medium Shading 2 Accent 2" w:uiPriority="64"/>
+    <w:lsdException w:name="Medium List 1 Accent 2" w:uiPriority="65"/>
+    <w:lsdException w:name="Medium List 2 Accent 2" w:uiPriority="66"/>
+    <w:lsdException w:name="Medium Grid 1 Accent 2" w:uiPriority="67"/>
+    <w:lsdException w:name="Medium Grid 2 Accent 2" w:uiPriority="68"/>
+    <w:lsdException w:name="Medium Grid 3 Accent 2" w:uiPriority="69"/>
+    <w:lsdException w:name="Dark List Accent 2" w:uiPriority="70"/>
+    <w:lsdException w:name="Colorful Shading Accent 2" w:uiPriority="71"/>
+    <w:lsdException w:name="Colorful List Accent 2" w:uiPriority="72"/>
+    <w:lsdException w:name="Colorful Grid Accent 2" w:uiPriority="73"/>
+    <w:lsdException w:name="Light Shading Accent 3" w:uiPriority="60"/>
+    <w:lsdException w:name="Light List Accent 3" w:uiPriority="61"/>
+    <w:lsdException w:name="Light Grid Accent 3" w:uiPriority="62"/>
+    <w:lsdException w:name="Medium Shading 1 Accent 3" w:uiPriority="63"/>
+    <w:lsdException w:name="Medium Shading 2 Accent 3" w:uiPriority="64"/>
+    <w:lsdException w:name="Medium List 1 Accent 3" w:uiPriority="65"/>
+    <w:lsdException w:name="Medium List 2 Accent 3" w:uiPriority="66"/>
+    <w:lsdException w:name="Medium Grid 1 Accent 3" w:uiPriority="67"/>
+    <w:lsdException w:name="Medium Grid 2 Accent 3" w:uiPriority="68"/>
+    <w:lsdException w:name="Medium Grid 3 Accent 3" w:uiPriority="69"/>
+    <w:lsdException w:name="Dark List Accent 3" w:uiPriority="70"/>
+    <w:lsdException w:name="Colorful Shading Accent 3" w:uiPriority="71"/>
+    <w:lsdException w:name="Colorful List Accent 3" w:uiPriority="72"/>
+    <w:lsdException w:name="Colorful Grid Accent 3" w:uiPriority="73"/>
+    <w:lsdException w:name="Light Shading Accent 4" w:uiPriority="60"/>
+    <w:lsdException w:name="Light List Accent 4" w:uiPriority="61"/>
+    <w:lsdException w:name="Light Grid Accent 4" w:uiPriority="62"/>
+    <w:lsdException w:name="Medium Shading 1 Accent 4" w:uiPriority="63"/>
+    <w:lsdException w:name="Medium Shading 2 Accent 4" w:uiPriority="64"/>
+    <w:lsdException w:name="Medium List 1 Accent 4" w:uiPriority="65"/>
+    <w:lsdException w:name="Medium List 2 Accent 4" w:uiPriority="66"/>
+    <w:lsdException w:name="Medium Grid 1 Accent 4" w:uiPriority="67"/>
+    <w:lsdException w:name="Medium Grid 2 Accent 4" w:uiPriority="68"/>
+    <w:lsdException w:name="Medium Grid 3 Accent 4" w:uiPriority="69"/>
+    <w:lsdException w:name="Dark List Accent 4" w:uiPriority="70"/>
+    <w:lsdException w:name="Colorful Shading Accent 4" w:uiPriority="71"/>
+    <w:lsdException w:name="Colorful List Accent 4" w:uiPriority="72"/>
+    <w:lsdException w:name="Colorful Grid Accent 4" w:uiPriority="73"/>
+    <w:lsdException w:name="Light Shading Accent 5" w:uiPriority="60"/>
+    <w:lsdException w:name="Light List Accent 5" w:uiPriority="61"/>
+    <w:lsdException w:name="Light Grid Accent 5" w:uiPriority="62"/>
+    <w:lsdException w:name="Medium Shading 1 Accent 5" w:uiPriority="63"/>
+    <w:lsdException w:name="Medium Shading 2 Accent 5" w:uiPriority="64"/>
+    <w:lsdException w:name="Medium List 1 Accent 5" w:uiPriority="65"/>
+    <w:lsdException w:name="Medium List 2 Accent 5" w:uiPriority="66"/>
+    <w:lsdException w:name="Medium Grid 1 Accent 5" w:uiPriority="67"/>
+    <w:lsdException w:name="Medium Grid 2 Accent 5" w:uiPriority="68"/>
+    <w:lsdException w:name="Medium Grid 3 Accent 5" w:uiPriority="69"/>
+    <w:lsdException w:name="Dark List Accent 5" w:uiPriority="70"/>
+    <w:lsdException w:name="Colorful Shading Accent 5" w:uiPriority="71"/>
+    <w:lsdException w:name="Colorful List Accent 5" w:uiPriority="72"/>
+    <w:lsdException w:name="Colorful Grid Accent 5" w:uiPriority="73"/>
+    <w:lsdException w:name="Light Shading Accent 6" w:uiPriority="60"/>
+    <w:lsdException w:name="Light List Accent 6" w:uiPriority="61"/>
+    <w:lsdException w:name="Light Grid Accent 6" w:uiPriority="62"/>
+    <w:lsdException w:name="Medium Shading 1 Accent 6" w:uiPriority="63"/>
+    <w:lsdException w:name="Medium Shading 2 Accent 6" w:uiPriority="64"/>
+    <w:lsdException w:name="Medium List 1 Accent 6" w:uiPriority="65"/>
+    <w:lsdException w:name="Medium List 2 Accent 6" w:uiPriority="66"/>
+    <w:lsdException w:name="Medium Grid 1 Accent 6" w:uiPriority="67"/>
+    <w:lsdException w:name="Medium Grid 2 Accent 6" w:uiPriority="68"/>
+    <w:lsdException w:name="Medium Grid 3 Accent 6" w:uiPriority="69"/>
+    <w:lsdException w:name="Dark List Accent 6" w:uiPriority="70"/>
+    <w:lsdException w:name="Colorful Shading Accent 6" w:uiPriority="71"/>
+    <w:lsdException w:name="Colorful List Accent 6" w:uiPriority="72"/>
+    <w:lsdException w:name="Colorful Grid Accent 6" w:uiPriority="73"/>
+    <w:lsdException w:name="Subtle Emphasis" w:uiPriority="19" w:qFormat="1"/>
+    <w:lsdException w:name="Intense Emphasis" w:uiPriority="21" w:qFormat="1"/>
+    <w:lsdException w:name="Subtle Reference" w:uiPriority="31" w:qFormat="1"/>
+    <w:lsdException w:name="Intense Reference" w:uiPriority="32" w:qFormat="1"/>
+    <w:lsdException w:name="Book Title" w:uiPriority="33" w:qFormat="1"/>
+    <w:lsdException w:name="Bibliography" w:semiHidden="1" w:uiPriority="37" w:unhideWhenUsed="1"/>
+    <w:lsdException w:name="TOC Heading" w:semiHidden="1" w:uiPriority="39" w:unhideWhenUsed="1" w:qFormat="1"/>
+    <w:lsdException w:name="Plain Table 1" w:uiPriority="41"/>
+    <w:lsdException w:name="Plain Table 2" w:uiPriority="42"/>
+    <w:lsdException w:name="Plain Table 3" w:uiPriority="43"/>
+    <w:lsdException w:name="Plain Table 4" w:uiPriority="44"/>
+    <w:lsdException w:name="Plain Table 5" w:uiPriority="45"/>
+    <w:lsdException w:name="Grid Table Light" w:uiPriority="40"/>
+    <w:lsdException w:name="Grid Table 1 Light" w:uiPriority="46"/>
+    <w:lsdException w:name="Grid Table 2" w:uiPriority="47"/>
+    <w:lsdException w:name="Grid Table 3" w:uiPriority="48"/>
+    <w:lsdException w:name="Grid Table 4" w:uiPriority="49"/>
+    <w:lsdException w:name="Grid Table 5 Dark" w:uiPriority="50"/>
+    <w:lsdException w:name="Grid Table 6 Colorful" w:uiPriority="51"/>
+    <w:lsdException w:name="Grid Table 7 Colorful" w:uiPriority="52"/>
+    <w:lsdException w:name="Grid Table 1 Light Accent 1" w:uiPriority="46"/>
+    <w:lsdException w:name="Grid Table 2 Accent 1" w:uiPriority="47"/>
+    <w:lsdException w:name="Grid Table 3 Accent 1" w:uiPriority="48"/>
+    <w:lsdException w:name="Grid Table 4 Accent 1" w:uiPriority="49"/>
+    <w:lsdException w:name="Grid Table 5 Dark Accent 1" w:uiPriority="50"/>
+    <w:lsdException w:name="Grid Table 6 Colorful Accent 1" w:uiPriority="51"/>
+    <w:lsdException w:name="Grid Table 7 Colorful Accent 1" w:uiPriority="52"/>
+    <w:lsdException w:name="Grid Table 1 Light Accent 2" w:uiPriority="46"/>
+    <w:lsdException w:name="Grid Table 2 Accent 2" w:uiPriority="47"/>
+    <w:lsdException w:name="Grid Table 3 Accent 2" w:uiPriority="48"/>
+    <w:lsdException w:name="Grid Table 4 Accent 2" w:uiPriority="49"/>
+    <w:lsdException w:name="Grid Table 5 Dark Accent 2" w:uiPriority="50"/>
+    <w:lsdException w:name="Grid Table 6 Colorful Accent 2" w:uiPriority="51"/>
+    <w:lsdException w:name="Grid Table 7 Colorful Accent 2" w:uiPriority="52"/>
+    <w:lsdException w:name="Grid Table 1 Light Accent 3" w:uiPriority="46"/>
+    <w:lsdException w:name="Grid Table 2 Accent 3" w:uiPriority="47"/>
+    <w:lsdException w:name="Grid Table 3 Accent 3" w:uiPriority="48"/>
+    <w:lsdException w:name="Grid Table 4 Accent 3" w:uiPriority="49"/>
+    <w:lsdException w:name="Grid Table 5 Dark Accent 3" w:uiPriority="50"/>
+    <w:lsdException w:name="Grid Table 6 Colorful Accent 3" w:uiPriority="51"/>
+    <w:lsdException w:name="Grid Table 7 Colorful Accent 3" w:uiPriority="52"/>
+    <w:lsdException w:name="Grid Table 1 Light Accent 4" w:uiPriority="46"/>
+    <w:lsdException w:name="Grid Table 2 Accent 4" w:uiPriority="47"/>
+    <w:lsdException w:name="Grid Table 3 Accent 4" w:uiPriority="48"/>
+    <w:lsdException w:name="Grid Table 4 Accent 4" w:uiPriority="49"/>
+    <w:lsdException w:name="Grid Table 5 Dark Accent 4" w:uiPriority="50"/>
+    <w:lsdException w:name="Grid Table 6 Colorful Accent 4" w:uiPriority="51"/>
+    <w:lsdException w:name="Grid Table 7 Colorful Accent 4" w:uiPriority="52"/>
+    <w:lsdException w:name="Grid Table 1 Light Accent 5" w:uiPriority="46"/>
+    <w:lsdException w:name="Grid Table 2 Accent 5" w:uiPriority="47"/>
+    <w:lsdException w:name="Grid Table 3 Accent 5" w:uiPriority="48"/>
+    <w:lsdException w:name="Grid Table 4 Accent 5" w:uiPriority="49"/>
+    <w:lsdException w:name="Grid Table 5 Dark Accent 5" w:uiPriority="50"/>
+    <w:lsdException w:name="Grid Table 6 Colorful Accent 5" w:uiPriority="51"/>
+    <w:lsdException w:name="Grid Table 7 Colorful Accent 5" w:uiPriority="52"/>
+    <w:lsdException w:name="Grid Table 1 Light Accent 6" w:uiPriority="46"/>
+    <w:lsdException w:name="Grid Table 2 Accent 6" w:uiPriority="47"/>
+    <w:lsdException w:name="Grid Table 3 Accent 6" w:uiPriority="48"/>
+    <w:lsdException w:name="Grid Table 4 Accent 6" w:uiPriority="49"/>
+    <w:lsdException w:name="Grid Table 5 Dark Accent 6" w:uiPriority="50"/>
+    <w:lsdException w:name="Grid Table 6 Colorful Accent 6" w:uiPriority="51"/>
+    <w:lsdException w:name="Grid Table 7 Colorful Accent 6" w:uiPriority="52"/>
+    <w:lsdException w:name="List Table 1 Light" w:uiPriority="46"/>
+    <w:lsdException w:name="List Table 2" w:uiPriority="47"/>
+    <w:lsdException w:name="List Table 3" w:uiPriority="48"/>
+    <w:lsdException w:name="List Table 4" w:uiPriority="49"/>
+    <w:lsdException w:name="List Table 5 Dark" w:uiPriority="50"/>
+    <w:lsdException w:name="List Table 6 Colorful" w:uiPriority="51"/>
+    <w:lsdException w:name="List Table 7 Colorful" w:uiPriority="52"/>
+    <w:lsdException w:name="List Table 1 Light Accent 1" w:uiPriority="46"/>
+    <w:lsdException w:name="List Table 2 Accent 1" w:uiPriority="47"/>
+    <w:lsdException w:name="List Table 3 Accent 1" w:uiPriority="48"/>
+    <w:lsdException w:name="List Table 4 Accent 1" w:uiPriority="49"/>
+    <w:lsdException w:name="List Table 5 Dark Accent 1" w:uiPriority="50"/>
+    <w:lsdException w:name="List Table 6 Colorful Accent 1" w:uiPriority="51"/>
+    <w:lsdException w:name="List Table 7 Colorful Accent 1" w:uiPriority="52"/>
+    <w:lsdException w:name="List Table 1 Light Accent 2" w:uiPriority="46"/>
+    <w:lsdException w:name="List Table 2 Accent 2" w:uiPriority="47"/>
+    <w:lsdException w:name="List Table 3 Accent 2" w:uiPriority="48"/>
+    <w:lsdException w:name="List Table 4 Accent 2" w:uiPriority="49"/>
+    <w:lsdException w:name="List Table 5 Dark Accent 2" w:uiPriority="50"/>
+    <w:lsdException w:name="List Table 6 Colorful Accent 2" w:uiPriority="51"/>
+    <w:lsdException w:name="List Table 7 Colorful Accent 2" w:uiPriority="52"/>
+    <w:lsdException w:name="List Table 1 Light Accent 3" w:uiPriority="46"/>
+    <w:lsdException w:name="List Table 2 Accent 3" w:uiPriority="47"/>
+    <w:lsdException w:name="List Table 3 Accent 3" w:uiPriority="48"/>
+    <w:lsdException w:name="List Table 4 Accent 3" w:uiPriority="49"/>
+    <w:lsdException w:name="List Table 5 Dark Accent 3" w:uiPriority="50"/>
+    <w:lsdException w:name="List Table 6 Colorful Accent 3" w:uiPriority="51"/>
+    <w:lsdException w:name="List Table 7 Colorful Accent 3" w:uiPriority="52"/>
+    <w:lsdException w:name="List Table 1 Light Accent 4" w:uiPriority="46"/>
+    <w:lsdException w:name="List Table 2 Accent 4" w:uiPriority="47"/>
+    <w:lsdException w:name="List Table 3 Accent 4" w:uiPriority="48"/>
+    <w:lsdException w:name="List Table 4 Accent 4" w:uiPriority="49"/>
+    <w:lsdException w:name="List Table 5 Dark Accent 4" w:uiPriority="50"/>
+    <w:lsdException w:name="List Table 6 Colorful Accent 4" w:uiPriority="51"/>
+    <w:lsdException w:name="List Table 7 Colorful Accent 4" w:uiPriority="52"/>
+    <w:lsdException w:name="List Table 1 Light Accent 5" w:uiPriority="46"/>
+    <w:lsdException w:name="List Table 2 Accent 5" w:uiPriority="47"/>
+    <w:lsdException w:name="List Table 3 Accent 5" w:uiPriority="48"/>
+    <w:lsdException w:name="List Table 4 Accent 5" w:uiPriority="49"/>
+    <w:lsdException w:name="List Table 5 Dark Accent 5" w:uiPriority="50"/>
+    <w:lsdException w:name="List Table 6 Colorful Accent 5" w:uiPriority="51"/>
+    <w:lsdException w:name="List Table 7 Colorful Accent 5" w:uiPriority="52"/>
+    <w:lsdException w:name="List Table 1 Light Accent 6" w:uiPriority="46"/>
+    <w:lsdException w:name="List Table 2 Accent 6" w:uiPriority="47"/>
+    <w:lsdException w:name="List Table 3 Accent 6" w:uiPriority="48"/>
+    <w:lsdException w:name="List Table 4 Accent 6" w:uiPriority="49"/>
+    <w:lsdException w:name="List Table 5 Dark Accent 6" w:uiPriority="50"/>
+    <w:lsdException w:name="List Table 6 Colorful Accent 6" w:uiPriority="51"/>
+    <w:lsdException w:name="List Table 7 Colorful Accent 6" w:uiPriority="52"/>
+    <w:lsdException w:name="Mention" w:semiHidden="1" w:unhideWhenUsed="1"/>
+    <w:lsdException w:name="Smart Hyperlink" w:semiHidden="1" w:unhideWhenUsed="1"/>
+    <w:lsdException w:name="Hashtag" w:semiHidden="1" w:unhideWhenUsed="1"/>
+    <w:lsdException w:name="Unresolved Mention" w:semiHidden="1" w:unhideWhenUsed="1"/>
+    <w:lsdException w:name="Smart Link" w:semiHidden="1" w:unhideWhenUsed="1"/>
+  </w:latentStyles>
+  <w:style w:type="paragraph" w:default="1" w:styleId="Normal">
+    <w:name w:val="Normal"/>
+    <w:qFormat/>
+  </w:style>
+  <w:style w:type="character" w:default="1" w:styleId="DefaultParagraphFont">
+    <w:name w:val="Default Paragraph Font"/>
+    <w:uiPriority w:val="1"/>
+    <w:semiHidden/>
+    <w:unhideWhenUsed/>
+  </w:style>
+  <w:style w:type="table" w:default="1" w:styleId="TableNormal">
+    <w:name w:val="Normal Table"/>
+    <w:uiPriority w:val="99"/>
+    <w:semiHidden/>
+    <w:unhideWhenUsed/>
+    <w:tblPr>
+      <w:tblInd w:w="0" w:type="dxa"/>
+      <w:tblCellMar>
+        <w:top w:w="0" w:type="dxa"/>
+        <w:left w:w="108" w:type="dxa"/>
+        <w:bottom w:w="0" w:type="dxa"/>
+        <w:right w:w="108" w:type="dxa"/>
+      </w:tblCellMar>
+    </w:tblPr>
+  </w:style>
+  <w:style w:type="numbering" w:default="1" w:styleId="NoList">
+    <w:name w:val="No List"/>
+    <w:uiPriority w:val="99"/>
+    <w:semiHidden/>
+    <w:unhideWhenUsed/>
+  </w:style>
+  <w:style w:type="character" w:styleId="PlaceholderText">
+    <w:name w:val="Placeholder Text"/>
+    <w:basedOn w:val="DefaultParagraphFont"/>
+    <w:uiPriority w:val="99"/>
+    <w:semiHidden/>
+    <w:rsid w:val="00ED2926"/>
+    <w:rPr>
+      <w:color w:val="666666"/>
+    </w:rPr>
+  </w:style>
+  <w:style w:type="paragraph" w:customStyle="1" w:styleId="28E4DCBA4D614B94A8A69633A5BBB639">
+    <w:name w:val="28E4DCBA4D614B94A8A69633A5BBB639"/>
+    <w:rsid w:val="00ED2926"/>
+  </w:style>
+  <w:style w:type="character" w:customStyle="1" w:styleId="Style1">
+    <w:name w:val="Style1"/>
+    <w:basedOn w:val="DefaultParagraphFont"/>
+    <w:uiPriority w:val="1"/>
+    <w:rsid w:val="00ED2926"/>
+    <w:rPr>
+      <w:rFonts w:ascii="B Nazanin" w:hAnsi="B Nazanin"/>
+      <w:sz w:val="24"/>
+    </w:rPr>
+  </w:style>
+  <w:style w:type="paragraph" w:customStyle="1" w:styleId="47B176D7B2A845F98A63A3EBD4980059">
+    <w:name w:val="47B176D7B2A845F98A63A3EBD4980059"/>
+    <w:rsid w:val="00ED2926"/>
+  </w:style>
+</w:styles>
+</file>
+
+<file path=word/glossary/webSettings.xml><?xml version="1.0" encoding="utf-8"?>
+<w:webSettings xmlns:mc="http://schemas.openxmlformats.org/markup-compatibility/2006" xmlns:r="http://schemas.openxmlformats.org/officeDocument/2006/relationships" xmlns:w="http://schemas.openxmlformats.org/wordprocessingml/2006/main" xmlns:w14="http://schemas.microsoft.com/office/word/2010/wordml" xmlns:w15="http://schemas.microsoft.com/office/word/2012/wordml" xmlns:w16cex="http://schemas.microsoft.com/office/word/2018/wordml/cex" xmlns:w16cid="http://schemas.microsoft.com/office/word/2016/wordml/cid" xmlns:w16="http://schemas.microsoft.com/office/word/2018/wordml" xmlns:w16du="http://schemas.microsoft.com/office/word/2023/wordml/word16du" xmlns:w16sdtdh="http://schemas.microsoft.com/office/word/2020/wordml/sdtdatahash" xmlns:w16sdtfl="http://schemas.microsoft.com/office/word/2024/wordml/sdtformatlock" xmlns:w16se="http://schemas.microsoft.com/office/word/2015/wordml/symex" mc:Ignorable="w14 w15 w16se w16cid w16 w16cex w16sdtdh w16sdtfl w16du">
+  <w:optimizeForBrowser/>
+  <w:allowPNG/>
+</w:webSettings>
 </file>
 
 <file path=word/theme/theme1.xml><?xml version="1.0" encoding="utf-8"?>

</xml_diff>